<commit_message>
Apply Q1-Q16 answers and July 2026 catalogue checks to V3.1
Z.A1 now comes from the catalogue's Discount Structure sheet, with the
ΕΚΠΤΩΣΕΙΣ parameter sheet only for missing categories. Status stays in
column X (verified), but columns are still read by trimmed header.
Grey and purple cords are not colours for rule 3. Minimum Order
Increment is a pack signal when Numeric UOM = 1. Portal prices are a
documented source for EOL cables. The audit honours accepted deviations
and treats portal prices as MSRP.

Co-Authored-By: Claude Opus 5.5 <noreply@anthropic.com>
Claude-Session: https://claude.ai/code/session_01BzJGp7TZogkrcqXW4FbpaM
</commit_message>
<xml_diff>
--- a/docs/RULES_V3.1_Panduit_Τιμές.docx
+++ b/docs/RULES_V3.1_Panduit_Τιμές.docx
@@ -12,7 +12,7 @@
     </w:p>
     <w:p>
       <w:r>
-        <w:t>RULES v3.1 · SAP PRICELIST · Νίκος Λιάπης · Καύκας ΑΕ ICT · 09/2026</w:t>
+        <w:t>RULES v3.1 · SAP PRICELIST · Νίκος Λιάπης · Καύκας ΑΕ ICT · 09/2026 · ενημερωμένο με τις απαντήσεις Q1–Q16 και τον κατάλογο 1-JUL-2026</w:t>
       </w:r>
     </w:p>
     <w:p>
@@ -21,22 +21,7 @@
           <w:i/>
           <w:color w:val="804000"/>
         </w:rPr>
-        <w:t xml:space="preserve">Τα σημεία με </w:t>
-      </w:r>
-      <w:r>
-        <w:rPr>
-          <w:b/>
-          <w:i/>
-          <w:color w:val="804000"/>
-        </w:rPr>
-        <w:t>[ΕΚΚΡΕΜΕΙ]</w:t>
-      </w:r>
-      <w:r>
-        <w:rPr>
-          <w:i/>
-          <w:color w:val="804000"/>
-        </w:rPr>
-        <w:t xml:space="preserve"> περιμένουν απάντηση Νίκου (αρχείο ΠΡΟΣ_ΕΛΕΓΧΟ, φύλλο ΕΡΩΤΗΣΕΙΣ). Μέχρι να απαντηθούν, το script ακολουθεί τον προσωρινό κανόνα που γράφεται δίπλα και στέλνει τη γραμμή στο ΓΙΑ_ΕΛΕΓΧΟ.</w:t>
+        <w:t>Ανοιχτά σημεία (ΠΡΟΣ_ΕΛΕΓΧΟ v24, φύλλο ΕΡΩΤΗΣΕΙΣ, R1–R10): έκπτωση εργαλείων TL, P των 9 καλωδίων στο SAP, τιμή PLT1M-C0, και η λίστα ΠΑΚΕΤΑ_ΑΝΑ_ΓΡΑΜΜΗ. Οι κανόνες εδώ δεν εξαρτώνται από αυτά.</w:t>
       </w:r>
     </w:p>
     <w:p>
@@ -201,7 +186,7 @@
           </w:tcPr>
           <w:p>
             <w:r>
-              <w:t>από το φύλλο ΕΚΠΤΩΣΕΙΣ (σήμερα −58 ή −36)</w:t>
+              <w:t>από το φύλλο «Discount Structure» του καταλόγου (σήμερα κυρίως −58, −36 στα IM1A/IM1D, −40 στα IA/IE4/IE5/IE11)</w:t>
             </w:r>
           </w:p>
         </w:tc>
@@ -263,7 +248,16 @@
         <w:pStyle w:val="ListBullet"/>
       </w:pPr>
       <w:r>
-        <w:t>Γραμμή MSRP → το script βρίσκει την κατηγορία του κωδικού στον κατάλογο («Pricing Category 1»· αν αυτή είναι επικεφαλίδα ομάδας, τότε «Pricing Category 2» ή «3») και διαβάζει το Z.A1 από το φύλλο ΕΚΠΤΩΣΕΙΣ.</w:t>
+        <w:t xml:space="preserve">Γραμμή MSRP → το script βρίσκει την κατηγορία του κωδικού στον κατάλογο («Pricing Category 1»· αν δεν υπάρχει στο Discount Structure, τότε «Pricing Category 2», μετά «3») και διαβάζει τη στήλη DISCOUNT του φύλλου </w:t>
+      </w:r>
+      <w:r>
+        <w:rPr>
+          <w:b/>
+        </w:rPr>
+        <w:t>Discount Structure του ίδιου του καταλόγου</w:t>
+      </w:r>
+      <w:r>
+        <w:t xml:space="preserve"> (0,58 → Z.A1 = −58). Το φύλλο ΕΚΠΤΩΣΕΙΣ του ΠΑΡΑΜΕΤΡΟΙ κρατά ΜΟΝΟ κατηγορίες που λείπουν από εκεί (σήμερα τα εργαλεία TL1/TL3–TL10). DISCOUNT = «MSRP» ή κενό → ΓΙΑ_ΕΛΕΓΧΟ.</w:t>
       </w:r>
     </w:p>
     <w:p>
@@ -271,7 +265,7 @@
         <w:pStyle w:val="ListBullet2"/>
       </w:pPr>
       <w:r>
-        <w:t>Κατηγορία που λείπει από το ΕΚΠΤΩΣΕΙΣ: αν το υπάρχον Z.A1 είναι ≠ 0, κράτα το. Αν είναι 0, η γραμμή πάει στο ΓΙΑ_ΕΛΕΓΧΟ και κρατά την παλιά τιμή.</w:t>
+        <w:t>Κατηγορία που λείπει και από το Discount Structure και από το ΕΚΠΤΩΣΕΙΣ: αν το υπάρχον Z.A1 είναι ≠ 0, κράτα το. Αν είναι 0, η γραμμή πάει στο ΓΙΑ_ΕΛΕΓΧΟ και κρατά την παλιά τιμή.</w:t>
       </w:r>
     </w:p>
     <w:p>
@@ -279,7 +273,7 @@
         <w:pStyle w:val="ListBullet2"/>
       </w:pPr>
       <w:r>
-        <w:t>Υπάρχον Z.A1 ≠ 0 που διαφέρει από το ΕΚΠΤΩΣΕΙΣ (π.χ. −57, −59): ΔΕΝ αλλάζει αυτόματα. Πάει στο φύλλο ΕΛΕΓΧΟΣ_ZA1.</w:t>
+        <w:t>Υπάρχον Z.A1 ≠ 0 που διαφέρει από το Discount Structure (π.χ. −57, −59): ΔΕΝ αλλάζει αυτόματα. Πάει στο φύλλο ΕΛΕΓΧΟΣ_ZA1.</w:t>
       </w:r>
     </w:p>
     <w:p>
@@ -332,7 +326,7 @@
           <w:i/>
           <w:color w:val="804000"/>
         </w:rPr>
-        <w:t>Στο v3 οι στήλες δίνονταν με γράμμα. Ο επίσημος οδηγός Panduit βάζει το Status στη στήλη S και στη X το Cancellable/Returnable, ενώ το v3 έλεγε X = Status.</w:t>
+        <w:t>Επαληθεύτηκε στον κατάλογο 1-JUL-2026: Status = στήλη X, και τα 268 EXPIRED της v23 ταιριάζουν 100%. Το γράμμα όμως μπορεί να αλλάξει σε νέο κατάλογο (ο οδηγός PDF έχει άλλη διάταξη), γι' αυτό όλα διαβάζονται από το header. Τα headers έχουν κενά στο τέλος («Inner (PKG) ») και το «Numeric Prc. UOM» είναι κείμενο με κενά («100      »). Κάνε trim πριν από κάθε σύγκριση.</w:t>
       </w:r>
     </w:p>
     <w:p>
@@ -468,16 +462,7 @@
         <w:pStyle w:val="ListBullet2"/>
       </w:pPr>
       <w:r>
-        <w:t xml:space="preserve">Περίπτωση v22/v23: FPSN924 160,94 → 137.692 και FQSNZ12 354,12 → 305.776 (×855). Με ÷1000 και οι δύο βγαίνουν −14%. </w:t>
-      </w:r>
-      <w:r>
-        <w:rPr>
-          <w:b/>
-        </w:rPr>
-        <w:t>[ΕΚΚΡΕΜΕΙ]</w:t>
-      </w:r>
-      <w:r>
-        <w:t xml:space="preserve"> επιβεβαίωση ότι η SPA είναι ανά 1000m.</w:t>
+        <w:t>Περίπτωση v22/v23: FPSN924 160,94 → 137.692 και FQSNZ12 354,12 → 305.776 (×855). Η SPA ήταν ανά 1000m (επιβεβαίωση Νίκου 09/2026, φύλλο ΜΟΝΑΔΑ_SPA). Το portal της Panduit τιμολογεί τα θωρακισμένα οπτικά «per 1,000 MT».</w:t>
       </w:r>
     </w:p>
     <w:p>
@@ -613,16 +598,16 @@
         <w:t>Χρώμα</w:t>
       </w:r>
       <w:r>
-        <w:t xml:space="preserve"> = ρίζα λέξης, στην αρχή λέξης: ΜΠΛΕ · ΠΡΑΣ · ΚΟΚΚ · ΚΙΤΡ · ΓΚΡΙ · ΜΑΥΡ · ΠΟΡΤΟΚ · ΒΙΟΛ · </w:t>
+        <w:t xml:space="preserve"> = ρίζα λέξης, στην αρχή λέξης: ΜΠΛΕ · ΠΡΑΣ · ΚΟΚΚ · ΚΙΤΡ · ΜΑΥΡ · ΠΟΡΤΟΚ · ΒΙΟΛ · ΡΟΖ. Ρίζες και όχι ολόκληρες λέξεις, γιατί η περιγραφή κόβεται («ΚΟΚΚ.», «ΠΡΑΣ», «ΠΟΡΤΟΚ»). </w:t>
       </w:r>
       <w:r>
         <w:rPr>
           <w:b/>
         </w:rPr>
-        <w:t>ΜΩΒ</w:t>
+        <w:t>ΛΕΥΚΟ, ΓΚΡΙ και ΜΩΒ ΔΕΝ είναι χρώματα</w:t>
       </w:r>
       <w:r>
-        <w:t xml:space="preserve"> · ΡΟΖ. Ρίζες και όχι ολόκληρες λέξεις, γιατί η περιγραφή κόβεται («ΚΟΚΚ.», «ΠΡΑΣ», «ΠΟΡΤΟΚ»). Το ΛΕΥΚΟ δεν μετράει ως χρώμα.</w:t>
+        <w:t xml:space="preserve"> (απόφαση Νίκου 09/2026): ακολουθούν τον κανόνα 4 όπως τα λευκά.</w:t>
       </w:r>
     </w:p>
     <w:p>
@@ -630,7 +615,7 @@
         <w:pStyle w:val="ListBullet2"/>
       </w:pPr>
       <w:r>
-        <w:t>Στο v3 έλειπε το ΜΩΒ. Έτσι το UTP28SP1MVL πήρε SPA, ενώ τα αδέλφια του (UTP28SP2MVL, STP28X2MVL) πήραν MSRP.</w:t>
+        <w:t>Στο v23 τα γκρι cord (STP…MIG) πήγαν σε MSRP με τον κανόνα 3 και το καθαρό κόστος ανέβηκε ×2,1–2,4.</w:t>
       </w:r>
     </w:p>
     <w:p>
@@ -644,16 +629,7 @@
         <w:t>Cord χωρίς λέξη χρώματος</w:t>
       </w:r>
       <w:r>
-        <w:t xml:space="preserve"> (π.χ. όλα τα οπτικά P CORD FO…, UTPSP…MY) θεωρείται ΛΕΥΚΟ, όπως έγινε στο v23. </w:t>
-      </w:r>
-      <w:r>
-        <w:rPr>
-          <w:b/>
-        </w:rPr>
-        <w:t>[ΕΚΚΡΕΜΕΙ]</w:t>
-      </w:r>
-      <w:r>
-        <w:t xml:space="preserve"> επιβεβαίωση.</w:t>
+        <w:t xml:space="preserve"> (π.χ. όλα τα οπτικά P CORD FO…, UTPSP…MY) θεωρείται ΛΕΥΚΟ (επιβεβαίωση Νίκου 09/2026).</w:t>
       </w:r>
     </w:p>
     <w:p>
@@ -764,6 +740,20 @@
         <w:rPr>
           <w:b/>
         </w:rPr>
+        <w:t>ΝΕΟ (κατάλογος):</w:t>
+      </w:r>
+      <w:r>
+        <w:t xml:space="preserve"> όταν Numeric Prc. UOM = 1 αλλά «Minimum Order Increment» ή «Inner» &gt; 1, η Panduit τιμολογεί το τεμάχιο αλλά πουλά μόνο κουτί (π.χ. CNWSM6-C: 5,53/τεμ., PK100, MOQ 100). Αν ο κωδικός δεν είναι στο ΠΑΚΕΤΑ → ΓΙΑ_ΕΛΕΓΧΟ μία φορά. Στα 07/2026 ήταν 182 κωδικοί (λίστα ΠΑΚΕΤΑ_ΑΝΑ_ΓΡΑΜΜΗ, ΠΡΟΣ_ΕΛΕΓΧΟ v24).</w:t>
+      </w:r>
+    </w:p>
+    <w:p>
+      <w:pPr>
+        <w:pStyle w:val="ListBullet"/>
+      </w:pPr>
+      <w:r>
+        <w:rPr>
+          <w:b/>
+        </w:rPr>
         <w:t>ΝΕΟ:</w:t>
       </w:r>
       <w:r>
@@ -807,7 +797,7 @@
         <w:pStyle w:val="ListBullet"/>
       </w:pPr>
       <w:r>
-        <w:t>Αν δεν είναι καλώδιο (§5) αλλά έχει βάση Μ, η διαίρεση γίνεται κανονικά. Την πιάνει όμως η δικλείδα Δ1 αν η παλιά τιμή ήταν ανά ρολό (π.χ. T024X000FJT, ταινία, 91,49 → 3,12).</w:t>
+        <w:t>Αν δεν είναι καλώδιο (§5) αλλά έχει βάση Μ, η διαίρεση γίνεται κανονικά. Την πιάνει όμως η Δ1 αν η παλιά τιμή ήταν ανά ρολό. Το T024X000FJT (ταινία) πουλιέται ανά ρολό: OVERRIDE «μονάδα = 1», και η βάση Μ στο SAP πρέπει να γίνει PC.</w:t>
       </w:r>
     </w:p>
     <w:p>
@@ -1436,6 +1426,20 @@
         <w:rPr>
           <w:b/>
         </w:rPr>
+        <w:t>Σύμβαση SAP:</w:t>
+      </w:r>
+      <w:r>
+        <w:t xml:space="preserve"> τα καλώδια πουλιούνται ανά 1 μέτρο (βάση Μ), αλλά η τιμή μπαίνει ανά 100 μέτρα. Γι' αυτό το P πρέπει να είναι 100.</w:t>
+      </w:r>
+    </w:p>
+    <w:p>
+      <w:pPr>
+        <w:pStyle w:val="ListBullet"/>
+      </w:pPr>
+      <w:r>
+        <w:rPr>
+          <w:b/>
+        </w:rPr>
         <w:t>Αρχική τιμή = Τιμή Panduit ÷ μονάδα × 100.</w:t>
       </w:r>
       <w:r>
@@ -1883,13 +1887,7 @@
         <w:pStyle w:val="ListBullet"/>
       </w:pPr>
       <w:r>
-        <w:t xml:space="preserve">ΑΚΡΟΔΕΚΤΕΣ / ΚΩΣ ΠΡΕΣΑΣ: πάντα ανά τεμάχιο, ΕΚΤΟΣ αν η περιγραφή δηλώνει συσκευασία (π.χ. DNFR14-250FIB-M «1000ΤΜΧ»). Επιβεβαιωμένο σε 53 απαντήσεις. Το LCAS6-14-L είναι καταχωρημένο ΠΑΚΕΤΟ ×50 στο ΠΑΚΕΤΑ (07/2026) χωρίς ένδειξη στην περιγραφή, ενώ όλοι οι άλλοι LCA/LCC/LCD είναι ΤΕΜΑΧΙΟ. </w:t>
-      </w:r>
-      <w:r>
-        <w:rPr>
-          <w:b/>
-        </w:rPr>
-        <w:t>[ΕΚΚΡΕΜΕΙ]</w:t>
+        <w:t>ΑΚΡΟΔΕΚΤΕΣ / ΚΩΣ ΠΡΕΣΑΣ: πάντα ανά τεμάχιο, ΕΚΤΟΣ αν η περιγραφή δηλώνει συσκευασία (π.χ. DNFR14-250FIB-M «1000ΤΜΧ»). Επιβεβαιωμένο σε 54 απαντήσεις. Το LCAS6-14-L ήταν λάθος καταχώριση ΠΑΚΕΤΟ και διορθώθηκε σε ΤΕΜΑΧΙΟ (09/2026).</w:t>
       </w:r>
     </w:p>
     <w:p>
@@ -1919,7 +1917,7 @@
         <w:t>EXPIRED:</w:t>
       </w:r>
       <w:r>
-        <w:t xml:space="preserve"> Status καταλόγου (header «Status», ΟΧΙ η στήλη X) = Obsolete ή USE UP → σήμανση. Η τιμή υπολογίζεται κανονικά.</w:t>
+        <w:t xml:space="preserve"> Status καταλόγου (header «Status») = Obsolete ή USE UP → σήμανση. Η τιμή υπολογίζεται κανονικά.</w:t>
       </w:r>
     </w:p>
     <w:p>
@@ -1934,6 +1932,20 @@
       </w:r>
       <w:r>
         <w:t xml:space="preserve"> χωρίς SPA και εκτός καταλόγου → φύλλο EOL, κράτηση παλιάς τιμής και παλιού Z.A1.</w:t>
+      </w:r>
+    </w:p>
+    <w:p>
+      <w:pPr>
+        <w:pStyle w:val="ListBullet"/>
+      </w:pPr>
+      <w:r>
+        <w:rPr>
+          <w:b/>
+        </w:rPr>
+        <w:t>Έλεγχος στο portal:</w:t>
+      </w:r>
+      <w:r>
+        <w:t xml:space="preserve"> τα EOL καλώδια τα ελέγχει ο Νίκος στο Stock &amp; Price Check (bulk upload). Discontinued → EOL_ΕΠΙΒΕΒΑΙΩΜΕΝΑ. Όσα έχουν τιμή → πηγή «PORTAL», τιμή = MSRP portal ÷ μονάδα × 100, Z.A1 −58. Ο έλεγχος: MSRP × 0,42 = «Net cost» του portal. Στα 09/2026 ενημερώθηκαν έτσι 5 καλώδια. Τα 10 EOL με P = 1 είναι όλα Discontinued, άρα δεν χρειάζονται διόρθωση P.</w:t>
       </w:r>
     </w:p>
     <w:p>
@@ -2047,7 +2059,7 @@
         <w:t>ΕΛΕΓΧΟΣ_ZA1:</w:t>
       </w:r>
       <w:r>
-        <w:t xml:space="preserve"> γραμμές MSRP όπου το υπάρχον Z.A1 διαφέρει από το ΕΚΠΤΩΣΕΙΣ.</w:t>
+        <w:t xml:space="preserve"> γραμμές MSRP όπου το υπάρχον Z.A1 διαφέρει από το Discount Structure.</w:t>
       </w:r>
     </w:p>
     <w:p>
@@ -2168,7 +2180,7 @@
         <w:pStyle w:val="ListBullet"/>
       </w:pPr>
       <w:r>
-        <w:t>Το script γράφει το ζευγάρι τιμή + Z.A1 (το Z.A1 από τον κατάλογο μέσω ΕΚΠΤΩΣΕΙΣ), όπως έγινε στο v23. Το P μένει χειροκίνητο.</w:t>
+        <w:t>Το script γράφει το ζευγάρι τιμή + Z.A1 (το Z.A1 από το φύλλο Discount Structure του καταλόγου + ΕΚΠΤΩΣΕΙΣ για ό,τι λείπει), όπως έγινε στο v23. Το P μένει χειροκίνητο.</w:t>
       </w:r>
     </w:p>
     <w:p>
@@ -2176,7 +2188,7 @@
         <w:pStyle w:val="ListBullet"/>
       </w:pPr>
       <w:r>
-        <w:t>Οι στήλες βρίσκονται από το header. Το Status δεν είναι στη στήλη X.</w:t>
+        <w:t>Οι στήλες βρίσκονται από το header (με trim).</w:t>
       </w:r>
     </w:p>
     <w:p>
@@ -2216,7 +2228,7 @@
         <w:pStyle w:val="ListBullet"/>
       </w:pPr>
       <w:r>
-        <w:t>Patch cord = η περιγραφή αρχίζει με P CORD. Χρώματα ως ρίζες, με το ΜΩΒ. Cord χωρίς χρώμα = λευκό.</w:t>
+        <w:t>Patch cord = η περιγραφή αρχίζει με P CORD. Χρώματα ως ρίζες. ΓΚΡΙ και ΜΩΒ όχι χρώματα. Cord χωρίς χρώμα = λευκό.</w:t>
       </w:r>
     </w:p>
     <w:p>

</xml_diff>

<commit_message>
Update V3.1 for cables kept at P = 1 and SPA header format
Cables now follow the general ÷ unit × P formula, so the nine cables
that stay at P = 1 in SAP get a per-metre price and appear in the
ΚΑΛΩΔΙΑ list. SPA headers contain line breaks and are matched after
collapsing whitespace. The NFY6C04BU-FEG reference test uses P = 1.

Co-Authored-By: Claude Opus 5.5 <noreply@anthropic.com>
Claude-Session: https://claude.ai/code/session_01BzJGp7TZogkrcqXW4FbpaM
</commit_message>
<xml_diff>
--- a/docs/RULES_V3.1_Panduit_Τιμές.docx
+++ b/docs/RULES_V3.1_Panduit_Τιμές.docx
@@ -45,7 +45,7 @@
         <w:pStyle w:val="ListBullet"/>
       </w:pPr>
       <w:r>
-        <w:t>Το script ΔΕΝ γράφει ποτέ το «Τιμή υπολογισμένη ανά» (P). Όπου το P είναι λάθος, η γραμμή μπαίνει σε λίστα και το διορθώνει ο Νίκος στο SAP (§5).</w:t>
+        <w:t>Το script ΔΕΝ γράφει ποτέ το «Τιμή υπολογισμένη ανά» (P). Προσαρμόζει την τιμή στο P της γραμμής και βάζει κάθε καλώδιο με P ≠ 100 στη λίστα του φύλλου ΚΑΛΩΔΙΑ (§5).</w:t>
       </w:r>
     </w:p>
     <w:p>
@@ -340,7 +340,7 @@
         <w:t>SPA:</w:t>
       </w:r>
       <w:r>
-        <w:t xml:space="preserve"> μηνιαίο SPA MONITORING («…all_SPAs_from_PanServe.xlsm»), φύλλο CONNECTIVITY. Headers: SPA customer · NET PRICE · Part Number.</w:t>
+        <w:t xml:space="preserve"> μηνιαίο SPA MONITORING («…all_SPAs_from_PanServe.xlsm»), φύλλο CONNECTIVITY. Headers: SPA CUSTOMER · NET PRICE · PART NUMBER. Τα headers έχουν αλλαγές γραμμής μέσα («SPA\nCUSTOMER»): ένωσε τα κενά πριν συγκρίνεις. Το header της στήλης με το ×1,30 είναι ο αριθμός 1.3.</w:t>
       </w:r>
     </w:p>
     <w:p>
@@ -1333,7 +1333,7 @@
           </w:tcPr>
           <w:p>
             <w:r>
-              <w:t>208,37 (SPA NMM)</w:t>
+              <w:t>208,37 (SPA NMM 07/2026)</w:t>
             </w:r>
           </w:p>
         </w:tc>
@@ -1363,7 +1363,7 @@
           </w:tcPr>
           <w:p>
             <w:r>
-              <w:t>100</w:t>
+              <w:t>1 (R6)</w:t>
             </w:r>
           </w:p>
         </w:tc>
@@ -1373,7 +1373,7 @@
           </w:tcPr>
           <w:p>
             <w:r>
-              <w:t>68,32</w:t>
+              <w:t>0,6832</w:t>
             </w:r>
           </w:p>
         </w:tc>
@@ -1440,10 +1440,10 @@
         <w:rPr>
           <w:b/>
         </w:rPr>
-        <w:t>Αρχική τιμή = Τιμή Panduit ÷ μονάδα × 100.</w:t>
+        <w:t>Αρχική τιμή = Τιμή Panduit ÷ μονάδα × P.</w:t>
       </w:r>
       <w:r>
-        <w:t xml:space="preserve"> Ο πολλαπλασιαστής είναι πάντα 100, όχι το P της γραμμής.</w:t>
+        <w:t xml:space="preserve"> Με P = 100 η τιμή είναι ανά 100m.</w:t>
       </w:r>
     </w:p>
     <w:p>
@@ -1457,7 +1457,7 @@
         <w:t>Αν το P της γραμμής δεν είναι 100:</w:t>
       </w:r>
       <w:r>
-        <w:t xml:space="preserve"> ΜΗΝ το αλλάξεις. Γράψε την τιμή ανά 100m και σήμανε τη γραμμή κόκκινη στο φύλλο ΚΑΛΩΔΙΑ με το κείμενο «ΔΙΟΡΘΩΣΕ ΤΟ P: &lt;τιμή&gt; → 100». Όχι «διορθώθηκε»: το script δεν το έκανε.</w:t>
+        <w:t xml:space="preserve"> ΜΗΝ το αλλάξεις. Γράψε την τιμή για το P της γραμμής (P = 1 → ανά μέτρο) και βάλε τη γραμμή στο φύλλο ΚΑΛΩΔΙΑ με σήμανση «P = &lt;τιμή&gt;».</w:t>
       </w:r>
     </w:p>
     <w:p>
@@ -1465,7 +1465,7 @@
         <w:pStyle w:val="ListBullet2"/>
       </w:pPr>
       <w:r>
-        <w:t>Γιατί: τιμή ανά 100m σε πεδίο με P = 1 διαβάζεται από το SAP ως €/μέτρο. Το NFY6C04BU-FEG θα χρέωνε 68,32 €/m αντί για 0,68.</w:t>
+        <w:t>Γιατί: τιμή ανά 100m σε γραμμή με P = 1 διαβάζεται από το SAP ως €/μέτρο, δηλαδή ×100.</w:t>
       </w:r>
     </w:p>
     <w:p>
@@ -1473,13 +1473,7 @@
         <w:pStyle w:val="ListBullet2"/>
       </w:pPr>
       <w:r>
-        <w:rPr>
-          <w:b/>
-        </w:rPr>
-        <w:t>Μην ανεβάσεις τιμές στο SAP πριν διορθωθεί το P εκεί.</w:t>
-      </w:r>
-      <w:r>
-        <w:t xml:space="preserve"> Αν το upload διαβάζει μόνο την «Αρχική τιμή», το P στο SAP μένει 1.</w:t>
+        <w:t>09/2026: 9 καλώδια έχουν P = 1 στο SAP και ο Νίκος τα αφήνει έτσι (R6): FAKCZ12-40, FADC912-37, FAMC948-24, FAMC972-24, FAMC91A-24, PSM7004BU-KEM, FADCZ12-24, FADCZ06-24, NFY6C04BU-FEG. Η v25 γράφει τιμή ανά μέτρο σε αυτά.</w:t>
       </w:r>
     </w:p>
     <w:p>
@@ -2145,7 +2139,7 @@
         <w:pStyle w:val="ListNumber"/>
       </w:pPr>
       <w:r>
-        <w:t>Κανένα ενεργό καλώδιο με P ≠ 100 στο SAP (μετά τη χειροκίνητη διόρθωση).</w:t>
+        <w:t>Κάθε ενεργό καλώδιο με P ≠ 100 είναι στη λίστα του φύλλου ΚΑΛΩΔΙΑ και έχει τιμή για το δικό του P.</w:t>
       </w:r>
     </w:p>
     <w:p>
@@ -2244,7 +2238,7 @@
         <w:pStyle w:val="ListBullet"/>
       </w:pPr>
       <w:r>
-        <w:t>Τα καλώδια μετρώνται 83 ενεργά + 50 EOL. Το πλήθος δεν είναι τεστ. Η σήμανση λέει «ΔΙΟΡΘΩΣΕ» και όχι «διορθώθηκε».</w:t>
+        <w:t>Τα καλώδια μετρώνται 83 ενεργά + 50 EOL. Το πλήθος δεν είναι τεστ. Τα καλώδια ακολουθούν τον γενικό τύπο × P· με P = 1 η τιμή είναι ανά μέτρο.</w:t>
       </w:r>
     </w:p>
     <w:p>

</xml_diff>